<commit_message>
Launch Moloch v2, Open-Write Studio beta, differentiate two OW versions
- Update Moloch ebook downloads (new PDF/EPUB/DOCX/TXT from revised manuscript)
- Add Open-Write Studio v1.0.5 Windows installers (NSIS + MSI)
- Add two-version explanation to How It Works section
- Mark Moloch and Open-Write Studio as live in schedule
- Add download links and beta bug-report note for Studio
- Update Moloch file sizes in moloch.html
</commit_message>
<xml_diff>
--- a/downloads/Moloch.docx
+++ b/downloads/Moloch.docx
@@ -3121,7 +3121,7 @@
         <w:ind w:firstLine="432"/>
       </w:pPr>
       <w:r>
-        <w:t>The same shape appears in public health. The thalidomide disaster of the late 1950s — children born with severe birth defects because a drug was approved without adequate testing[16] — produced the Kefauver-Harris Amendment, the law that required pharmaceutical companies to prove a drug was safe before selling it.[17] Before the disaster, the law did not require that. After the disaster, it did. The reform was obvious. Too late for the children.</w:t>
+        <w:t>The same shape appears in public health. The thalidomide disaster of the late 1950s — children born with severe birth defects because a drug was approved without adequate testing[16] — produced the Kefauver-Harris Amendment, the law that required pharmaceutical companies to prove a drug was effective before selling it.[17] Before the disaster, the law required safety but not efficacy. After the disaster, it required both. The reform was obvious. Too late for the children.</w:t>
       </w:r>
     </w:p>
     <w:p>
@@ -4809,7 +4809,7 @@
         <w:ind w:firstLine="432"/>
       </w:pPr>
       <w:r>
-        <w:t>Reform fiduciary duty law to explicitly state that corporate directors are not required to prioritize quarterly earnings over long-term resilience, worker welfare, or public safety. The shareholder primacy that made Boeing's buybacks rational and Sarah's well-being algorithm impossible to deploy is not a law of nature.[11] It is a legal interpretation that can be reinterpreted or replaced.</w:t>
+        <w:t>Reform fiduciary duty law to explicitly state that corporate directors are not required to prioritize quarterly earnings over long-term resilience, worker welfare, or public safety. The shareholder-primacy norm that made Boeing's buybacks rational and Sarah's well-being algorithm impossible to deploy is not a law of nature.[11] It is a convention — not even an enforceable legal duty, as Lynn Stout has argued — that can be reinterpreted or replaced.</w:t>
       </w:r>
     </w:p>
     <w:p>
@@ -11418,7 +11418,7 @@
         <w:ind w:firstLine="432"/>
       </w:pPr>
       <w:r>
-        <w:t>Make the penalty scale with the violation. Treble damages with attorney fee-shifting, the way securities law does, so enforcement grows with violations instead of with appropriations.[3] Personal liability for responsible officers. Criminal referral for willful repeat violators. This is the wage-theft lever — and the tax-enforcement lever combined. The bill: the right extends "theft is theft" to payroll; the left accepts that the disorder half of the crime issue is real and gets its own honest response. Fee-shifting regimes in civil rights and securities law have been running for decades.[4] The mechanism exists. The application is missing.</w:t>
+        <w:t>Make the penalty scale with the violation. Treble damages with attorney fee-shifting, the way antitrust and the False Claims Act do, so enforcement grows with violations instead of with appropriations.[3] Personal liability for responsible officers. Criminal referral for willful repeat violators. This is the wage-theft lever — and the tax-enforcement lever combined. The bill: the right extends "theft is theft" to payroll; the left accepts that the disorder half of the crime issue is real and gets its own honest response. Fee-shifting regimes in civil rights and securities law have been running for decades.[4] The mechanism exists. The application is missing.</w:t>
       </w:r>
     </w:p>
     <w:p>
@@ -11498,15 +11498,15 @@
         <w:ind w:firstLine="432"/>
       </w:pPr>
       <w:r>
-        <w:t>The deterrence literature's most robust finding is that certainty of consequence deters where severity does not.[14] This matters here because the occasional dramatic prosecution — the one trader imprisoned after 2008 while the institutions settled — is severity-as-theater, and it discharges accountability energy exactly the way every other decoy discharges reform energy.[15] Certainty is expensive structure: funded enforcement, personal liability that survives corporate form, clawbacks that reach extracted wealth. Which loops this lever back into Levers 1 and 2 — visibility and enforcement capacity — and closes the system.</w:t>
-      </w:r>
-    </w:p>
-    <w:p>
-      <w:pPr>
-        <w:ind w:firstLine="432"/>
-      </w:pPr>
-      <w:r>
-        <w:t>The Purdue arc illustrates the gap. In 2007, Purdue's parent pled guilty to felony misbranding and three executives pled to misdemeanors — fines, no prison — and the business model continued and grew.[16] That is the impunity signal, stated as a date. In 2019, bankruptcy.[17] In 2021, a plan granting the family a lifetime litigation shield for $4.3 billion — immunity offered for purchase.[18] In June 2024, the Supreme Court refused the machinery: nonconsensual third-party releases could not launder the family through the company's bankruptcy.[19] And in 2026, a renegotiated $7.4 billion settlement became effective — the Sacklers paying over $1.5 billion immediately, Purdue dissolved, the family permanently barred from selling opioids in the United States, and more than thirty million internal documents to be made public.[20]</w:t>
+        <w:t>The deterrence literature's most robust finding is that certainty of consequence deters where severity does not.[14] This matters here because the occasional dramatic prosecution — Kareem Serageldin of Credit Suisse, the rare banker imprisoned for crisis-era fraud, sentenced to thirty months while the institutions settled for billions[15] — is severity-as-theater, and it discharges accountability energy exactly the way every other decoy discharges reform energy. Certainty is expensive structure: funded enforcement, personal liability that survives corporate form, clawbacks that reach extracted wealth. Which loops this lever back into Levers 1 and 2 — visibility and enforcement capacity — and closes the system.</w:t>
+      </w:r>
+    </w:p>
+    <w:p>
+      <w:pPr>
+        <w:ind w:firstLine="432"/>
+      </w:pPr>
+      <w:r>
+        <w:t>The Purdue arc illustrates the gap. In 2007, Purdue's parent pled guilty to felony misbranding and three executives pled to misdemeanors — fines, no prison — and the business model continued and grew.[16] That is the impunity signal, stated as a date. In 2019, bankruptcy.[17] In 2021, a plan granting the family a lifetime litigation shield for $4.3 billion — immunity offered for purchase.[18] In June 2024, the Supreme Court refused the machinery: nonconsensual third-party releases could not launder the family through the company's bankruptcy.[19] And in 2026, a renegotiated $7.4 billion settlement became effective — the Sacklers contributing over $6.5 billion over fifteen years, with more than $1.5 billion paid immediately, Purdue dissolved, the family permanently barred from selling opioids in the United States, and more than thirty million internal documents to be made public.[20]</w:t>
       </w:r>
     </w:p>
     <w:p>
@@ -13006,7 +13006,7 @@
         <w:ind w:firstLine="432"/>
       </w:pPr>
       <w:r>
-        <w:t>I was released from physical rehab in January of 2017. By the end of January, I knew I still had a lot of trouble ahead. I suppose the combination of not having professionals to put on my ostomy bags and maybe the change in diet both contributed to the torture I faced next. I was still very skinny and my ostomy bag sat right against my jutting-out hip bone. The bone pulled the bag up from the skin, exposing it. The digestive fluids coming from the ileum are highly corrosive. The colon does a lot to break down the corrosive enzymes that are present in the ileum, but even then if you leave normal fecal matter on your skin it is going to turn it raw.</w:t>
+        <w:t>I was released from physical rehab in January of 2017. By the end of January, I knew I still had a lot of trouble ahead. I suppose the combination of not having professionals to put on my ostomy bags and maybe the change in diet both contributed to the torture I faced next. I was still very skinny and my ostomy bag sat right against my jutting-out hip bone. The bone pulled the bag up from the skin, exposing it. The digestive fluids coming from the ileum are highly corrosive. The colon reabsorbs water and dilutes the corrosive digestive enzymes that enter it from the ileum, but even then if you leave normal fecal matter on your skin it is going to turn it raw.</w:t>
       </w:r>
     </w:p>
     <w:p>

</xml_diff>

<commit_message>
Sync Moloch DOCX and TXT to source manuscript files
</commit_message>
<xml_diff>
--- a/downloads/Moloch.docx
+++ b/downloads/Moloch.docx
@@ -3121,7 +3121,7 @@
         <w:ind w:firstLine="432"/>
       </w:pPr>
       <w:r>
-        <w:t>The same shape appears in public health. The thalidomide disaster of the late 1950s — children born with severe birth defects because a drug was approved without adequate testing[16] — produced the Kefauver-Harris Amendment, the law that required pharmaceutical companies to prove a drug was effective before selling it.[17] Before the disaster, the law required safety but not efficacy. After the disaster, it required both. The reform was obvious. Too late for the children.</w:t>
+        <w:t>The same shape appears in public health. The thalidomide disaster of the late 1950s — children born with severe birth defects because a drug was approved without adequate testing[16] — produced the Kefauver-Harris Amendment, the law that required pharmaceutical companies to prove a drug was safe before selling it.[17] Before the disaster, the law did not require that. After the disaster, it did. The reform was obvious. Too late for the children.</w:t>
       </w:r>
     </w:p>
     <w:p>
@@ -4809,7 +4809,7 @@
         <w:ind w:firstLine="432"/>
       </w:pPr>
       <w:r>
-        <w:t>Reform fiduciary duty law to explicitly state that corporate directors are not required to prioritize quarterly earnings over long-term resilience, worker welfare, or public safety. The shareholder-primacy norm that made Boeing's buybacks rational and Sarah's well-being algorithm impossible to deploy is not a law of nature.[11] It is a convention — not even an enforceable legal duty, as Lynn Stout has argued — that can be reinterpreted or replaced.</w:t>
+        <w:t>Reform fiduciary duty law to explicitly state that corporate directors are not required to prioritize quarterly earnings over long-term resilience, worker welfare, or public safety. The shareholder primacy that made Boeing's buybacks rational and Sarah's well-being algorithm impossible to deploy is not a law of nature.[11] It is a legal interpretation that can be reinterpreted or replaced.</w:t>
       </w:r>
     </w:p>
     <w:p>
@@ -11418,7 +11418,7 @@
         <w:ind w:firstLine="432"/>
       </w:pPr>
       <w:r>
-        <w:t>Make the penalty scale with the violation. Treble damages with attorney fee-shifting, the way antitrust and the False Claims Act do, so enforcement grows with violations instead of with appropriations.[3] Personal liability for responsible officers. Criminal referral for willful repeat violators. This is the wage-theft lever — and the tax-enforcement lever combined. The bill: the right extends "theft is theft" to payroll; the left accepts that the disorder half of the crime issue is real and gets its own honest response. Fee-shifting regimes in civil rights and securities law have been running for decades.[4] The mechanism exists. The application is missing.</w:t>
+        <w:t>Make the penalty scale with the violation. Treble damages with attorney fee-shifting, the way securities law does, so enforcement grows with violations instead of with appropriations.[3] Personal liability for responsible officers. Criminal referral for willful repeat violators. This is the wage-theft lever — and the tax-enforcement lever combined. The bill: the right extends "theft is theft" to payroll; the left accepts that the disorder half of the crime issue is real and gets its own honest response. Fee-shifting regimes in civil rights and securities law have been running for decades.[4] The mechanism exists. The application is missing.</w:t>
       </w:r>
     </w:p>
     <w:p>
@@ -11498,15 +11498,15 @@
         <w:ind w:firstLine="432"/>
       </w:pPr>
       <w:r>
-        <w:t>The deterrence literature's most robust finding is that certainty of consequence deters where severity does not.[14] This matters here because the occasional dramatic prosecution — Kareem Serageldin of Credit Suisse, the rare banker imprisoned for crisis-era fraud, sentenced to thirty months while the institutions settled for billions[15] — is severity-as-theater, and it discharges accountability energy exactly the way every other decoy discharges reform energy. Certainty is expensive structure: funded enforcement, personal liability that survives corporate form, clawbacks that reach extracted wealth. Which loops this lever back into Levers 1 and 2 — visibility and enforcement capacity — and closes the system.</w:t>
-      </w:r>
-    </w:p>
-    <w:p>
-      <w:pPr>
-        <w:ind w:firstLine="432"/>
-      </w:pPr>
-      <w:r>
-        <w:t>The Purdue arc illustrates the gap. In 2007, Purdue's parent pled guilty to felony misbranding and three executives pled to misdemeanors — fines, no prison — and the business model continued and grew.[16] That is the impunity signal, stated as a date. In 2019, bankruptcy.[17] In 2021, a plan granting the family a lifetime litigation shield for $4.3 billion — immunity offered for purchase.[18] In June 2024, the Supreme Court refused the machinery: nonconsensual third-party releases could not launder the family through the company's bankruptcy.[19] And in 2026, a renegotiated $7.4 billion settlement became effective — the Sacklers contributing over $6.5 billion over fifteen years, with more than $1.5 billion paid immediately, Purdue dissolved, the family permanently barred from selling opioids in the United States, and more than thirty million internal documents to be made public.[20]</w:t>
+        <w:t>The deterrence literature's most robust finding is that certainty of consequence deters where severity does not.[14] This matters here because the occasional dramatic prosecution — the one trader imprisoned after 2008 while the institutions settled — is severity-as-theater, and it discharges accountability energy exactly the way every other decoy discharges reform energy.[15] Certainty is expensive structure: funded enforcement, personal liability that survives corporate form, clawbacks that reach extracted wealth. Which loops this lever back into Levers 1 and 2 — visibility and enforcement capacity — and closes the system.</w:t>
+      </w:r>
+    </w:p>
+    <w:p>
+      <w:pPr>
+        <w:ind w:firstLine="432"/>
+      </w:pPr>
+      <w:r>
+        <w:t>The Purdue arc illustrates the gap. In 2007, Purdue's parent pled guilty to felony misbranding and three executives pled to misdemeanors — fines, no prison — and the business model continued and grew.[16] That is the impunity signal, stated as a date. In 2019, bankruptcy.[17] In 2021, a plan granting the family a lifetime litigation shield for $4.3 billion — immunity offered for purchase.[18] In June 2024, the Supreme Court refused the machinery: nonconsensual third-party releases could not launder the family through the company's bankruptcy.[19] And in 2026, a renegotiated $7.4 billion settlement became effective — the Sacklers paying over $1.5 billion immediately, Purdue dissolved, the family permanently barred from selling opioids in the United States, and more than thirty million internal documents to be made public.[20]</w:t>
       </w:r>
     </w:p>
     <w:p>
@@ -13006,7 +13006,7 @@
         <w:ind w:firstLine="432"/>
       </w:pPr>
       <w:r>
-        <w:t>I was released from physical rehab in January of 2017. By the end of January, I knew I still had a lot of trouble ahead. I suppose the combination of not having professionals to put on my ostomy bags and maybe the change in diet both contributed to the torture I faced next. I was still very skinny and my ostomy bag sat right against my jutting-out hip bone. The bone pulled the bag up from the skin, exposing it. The digestive fluids coming from the ileum are highly corrosive. The colon reabsorbs water and dilutes the corrosive digestive enzymes that enter it from the ileum, but even then if you leave normal fecal matter on your skin it is going to turn it raw.</w:t>
+        <w:t>I was released from physical rehab in January of 2017. By the end of January, I knew I still had a lot of trouble ahead. I suppose the combination of not having professionals to put on my ostomy bags and maybe the change in diet both contributed to the torture I faced next. I was still very skinny and my ostomy bag sat right against my jutting-out hip bone. The bone pulled the bag up from the skin, exposing it. The digestive fluids coming from the ileum are highly corrosive. The colon does a lot to break down the corrosive enzymes that are present in the ileum, but even then if you leave normal fecal matter on your skin it is going to turn it raw.</w:t>
       </w:r>
     </w:p>
     <w:p>

</xml_diff>